<commit_message>
docs: update changelog + devlog v1.8.0 with layout fix
Co-Authored-By: Claude Sonnet 4.6 <noreply@anthropic.com>
</commit_message>
<xml_diff>
--- a/devlog-v1.8.0.docx
+++ b/devlog-v1.8.0.docx
@@ -820,6 +820,114 @@
           <w:szCs w:val="18"/>
         </w:rPr>
         <w:t xml:space="preserve">}</w:t>
+      </w:r>
+    </w:p>
+    <w:p/>
+    <w:p>
+      <w:pPr>
+        <w:pStyle w:val="Heading2"/>
+      </w:pPr>
+      <w:r>
+        <w:t xml:space="preserve">Верстка паузы: кнопки сложности</w:t>
+      </w:r>
+    </w:p>
+    <w:p>
+      <w:pPr>
+        <w:spacing w:after="120"/>
+      </w:pPr>
+      <w:r>
+        <w:rPr>
+          <w:rFonts w:ascii="Arial" w:cs="Arial" w:eastAsia="Arial" w:hAnsi="Arial"/>
+          <w:sz w:val="22"/>
+          <w:szCs w:val="22"/>
+        </w:rPr>
+        <w:t xml:space="preserve">После релиза обнаружился layout-баг: три кнопки сложности (Easy / Normal / Hard) не помещались в строку панели паузы — NORMAL обрезался, HARD вылезал за границы.</w:t>
+      </w:r>
+    </w:p>
+    <w:p>
+      <w:pPr>
+        <w:spacing w:after="120"/>
+      </w:pPr>
+      <w:r>
+        <w:rPr>
+          <w:rFonts w:ascii="Arial" w:cs="Arial" w:eastAsia="Arial" w:hAnsi="Arial"/>
+          <w:sz w:val="22"/>
+          <w:szCs w:val="22"/>
+        </w:rPr>
+        <w:t xml:space="preserve">Причина: панель имеет max-width: 360px, а три lang-btn с padding 11px 18px в одной строке с меткой «СЛОЖНОСТЬ» суммарно дают ~340px — на грани. При русской локализации («ЛЕГКО / НОРМАЛ / СЛОЖНО») кнопки чуть шире и переполняют строку.</w:t>
+      </w:r>
+    </w:p>
+    <w:p>
+      <w:pPr>
+        <w:spacing w:after="120"/>
+      </w:pPr>
+      <w:r>
+        <w:rPr>
+          <w:rFonts w:ascii="Arial" w:cs="Arial" w:eastAsia="Arial" w:hAnsi="Arial"/>
+          <w:sz w:val="22"/>
+          <w:szCs w:val="22"/>
+        </w:rPr>
+        <w:t xml:space="preserve">Фикс через CSS: строка difficulty получила класс wrap, метка выносится на всю ширину сверху, кнопки растягиваются на полную ширину панели снизу:</w:t>
+      </w:r>
+    </w:p>
+    <w:p>
+      <w:pPr>
+        <w:shd w:fill="F2F2F2" w:val="clear"/>
+        <w:spacing w:after="0"/>
+        <w:ind w:left="360"/>
+      </w:pPr>
+      <w:r>
+        <w:rPr>
+          <w:rFonts w:ascii="Consolas" w:cs="Consolas" w:eastAsia="Consolas" w:hAnsi="Consolas"/>
+          <w:sz w:val="18"/>
+          <w:szCs w:val="18"/>
+        </w:rPr>
+        <w:t xml:space="preserve">.pause-row.wrap { flex-wrap: wrap; }</w:t>
+      </w:r>
+    </w:p>
+    <w:p>
+      <w:pPr>
+        <w:shd w:fill="F2F2F2" w:val="clear"/>
+        <w:spacing w:after="0"/>
+        <w:ind w:left="360"/>
+      </w:pPr>
+      <w:r>
+        <w:rPr>
+          <w:rFonts w:ascii="Consolas" w:cs="Consolas" w:eastAsia="Consolas" w:hAnsi="Consolas"/>
+          <w:sz w:val="18"/>
+          <w:szCs w:val="18"/>
+        </w:rPr>
+        <w:t xml:space="preserve">.pause-row.wrap .pause-label { width: 100%; }</w:t>
+      </w:r>
+    </w:p>
+    <w:p>
+      <w:pPr>
+        <w:shd w:fill="F2F2F2" w:val="clear"/>
+        <w:spacing w:after="0"/>
+        <w:ind w:left="360"/>
+      </w:pPr>
+      <w:r>
+        <w:rPr>
+          <w:rFonts w:ascii="Consolas" w:cs="Consolas" w:eastAsia="Consolas" w:hAnsi="Consolas"/>
+          <w:sz w:val="18"/>
+          <w:szCs w:val="18"/>
+        </w:rPr>
+        <w:t xml:space="preserve">.pause-row.wrap &gt; div { width: 100%; display: flex; }</w:t>
+      </w:r>
+    </w:p>
+    <w:p>
+      <w:pPr>
+        <w:shd w:fill="F2F2F2" w:val="clear"/>
+        <w:spacing w:after="0"/>
+        <w:ind w:left="360"/>
+      </w:pPr>
+      <w:r>
+        <w:rPr>
+          <w:rFonts w:ascii="Consolas" w:cs="Consolas" w:eastAsia="Consolas" w:hAnsi="Consolas"/>
+          <w:sz w:val="18"/>
+          <w:szCs w:val="18"/>
+        </w:rPr>
+        <w:t xml:space="preserve">.pause-row.wrap &gt; div .lang-btn { flex: 1; }</w:t>
       </w:r>
     </w:p>
     <w:p/>

</xml_diff>